<commit_message>
TZ v1.1 — wave 1 marked closed
Update header to track which items autonomously closed in commit 0110b8d.
Reflect in both .md and .docx versions. Word file is also pushed to
the Desktop copy.
</commit_message>
<xml_diff>
--- a/docs/TZ_FULLSTACK.docx
+++ b/docs/TZ_FULLSTACK.docx
@@ -35,7 +35,7 @@
           <w:i/>
           <w:color w:val="555555"/>
         </w:rPr>
-        <w:t>Дата: 2026-05-09 · Состояние кодовой базы: коммит `8e505d6`</w:t>
+        <w:t>Дата создания: 2026-05-09 · Версия 1.1 (после авто-прогона wave 1)</w:t>
       </w:r>
     </w:p>
     <w:p>
@@ -48,6 +48,100 @@
           <w:color w:val="555555"/>
         </w:rPr>
         <w:t>Прод: https://entrium-ai-v2.vercel.app</w:t>
+      </w:r>
+    </w:p>
+    <w:p>
+      <w:pPr>
+        <w:ind w:left="283"/>
+      </w:pPr>
+      <w:r>
+        <w:rPr>
+          <w:i/>
+          <w:color w:val="555555"/>
+        </w:rPr>
+      </w:r>
+    </w:p>
+    <w:p>
+      <w:pPr>
+        <w:ind w:left="283"/>
+      </w:pPr>
+      <w:r>
+        <w:rPr>
+          <w:i/>
+          <w:color w:val="555555"/>
+        </w:rPr>
+        <w:t>**Wave 1 закрыт автоматически (commit `0110b8d`):**</w:t>
+      </w:r>
+    </w:p>
+    <w:p>
+      <w:pPr>
+        <w:ind w:left="283"/>
+      </w:pPr>
+      <w:r>
+        <w:rPr>
+          <w:i/>
+          <w:color w:val="555555"/>
+        </w:rPr>
+        <w:t>- Безопасность: S-2, S-3, S-4, S-5, S-6, S-8/F-6, S-9, S-10, S-12 ✅</w:t>
+      </w:r>
+    </w:p>
+    <w:p>
+      <w:pPr>
+        <w:ind w:left="283"/>
+      </w:pPr>
+      <w:r>
+        <w:rPr>
+          <w:i/>
+          <w:color w:val="555555"/>
+        </w:rPr>
+        <w:t>- UX: U-1, U-8, U-12 ✅</w:t>
+      </w:r>
+    </w:p>
+    <w:p>
+      <w:pPr>
+        <w:ind w:left="283"/>
+      </w:pPr>
+      <w:r>
+        <w:rPr>
+          <w:i/>
+          <w:color w:val="555555"/>
+        </w:rPr>
+        <w:t>- Фичи: F-4 ✅</w:t>
+      </w:r>
+    </w:p>
+    <w:p>
+      <w:pPr>
+        <w:ind w:left="283"/>
+      </w:pPr>
+      <w:r>
+        <w:rPr>
+          <w:i/>
+          <w:color w:val="555555"/>
+        </w:rPr>
+        <w:t>- Качество: Q-1 (CI), частично S-1 (PAT убран из .git/config)</w:t>
+      </w:r>
+    </w:p>
+    <w:p>
+      <w:pPr>
+        <w:ind w:left="283"/>
+      </w:pPr>
+      <w:r>
+        <w:rPr>
+          <w:i/>
+          <w:color w:val="555555"/>
+        </w:rPr>
+      </w:r>
+    </w:p>
+    <w:p>
+      <w:pPr>
+        <w:ind w:left="283"/>
+      </w:pPr>
+      <w:r>
+        <w:rPr>
+          <w:i/>
+          <w:color w:val="555555"/>
+        </w:rPr>
+        <w:t>**Остаются на разработчика:** S-1 (отозвать токен в GitHub UI), S-7 (Telegram bot recreate), S-11, S-13, S-14, U-2…U-13 кроме U-1/U-8/U-12, F-1, F-2, F-3, F-5, F-7…F-13, контент-долг, Q-2…Q-5.</w:t>
       </w:r>
     </w:p>
     <w:p>

</xml_diff>

<commit_message>
TZ v1.2 — wave 2 marked closed
</commit_message>
<xml_diff>
--- a/docs/TZ_FULLSTACK.docx
+++ b/docs/TZ_FULLSTACK.docx
@@ -35,7 +35,7 @@
           <w:i/>
           <w:color w:val="555555"/>
         </w:rPr>
-        <w:t>Дата создания: 2026-05-09 · Версия 1.1 (после авто-прогона wave 1)</w:t>
+        <w:t>Дата создания: 2026-05-09 · Версия 1.2 (после авто-прогонов wave 1 + 2)</w:t>
       </w:r>
     </w:p>
     <w:p>
@@ -94,7 +94,7 @@
           <w:i/>
           <w:color w:val="555555"/>
         </w:rPr>
-        <w:t>- UX: U-1, U-8, U-12 ✅</w:t>
+        <w:t>- UX: U-1, U-8 (примитив), U-12 ✅</w:t>
       </w:r>
     </w:p>
     <w:p>
@@ -141,7 +141,66 @@
           <w:i/>
           <w:color w:val="555555"/>
         </w:rPr>
-        <w:t>**Остаются на разработчика:** S-1 (отозвать токен в GitHub UI), S-7 (Telegram bot recreate), S-11, S-13, S-14, U-2…U-13 кроме U-1/U-8/U-12, F-1, F-2, F-3, F-5, F-7…F-13, контент-долг, Q-2…Q-5.</w:t>
+        <w:t>**Wave 2 закрыт автоматически (commit `5b9393a`):**</w:t>
+      </w:r>
+    </w:p>
+    <w:p>
+      <w:pPr>
+        <w:ind w:left="283"/>
+      </w:pPr>
+      <w:r>
+        <w:rPr>
+          <w:i/>
+          <w:color w:val="555555"/>
+        </w:rPr>
+        <w:t>- UX: U-2 (settings sidebar nav), U-3 (applications bulk actions), U-5 (onboarding step indicator), U-7 (VoiceTextarea wrapper), U-8 применён к applications ✅</w:t>
+      </w:r>
+    </w:p>
+    <w:p>
+      <w:pPr>
+        <w:ind w:left="283"/>
+      </w:pPr>
+      <w:r>
+        <w:rPr>
+          <w:i/>
+          <w:color w:val="555555"/>
+        </w:rPr>
+        <w:t>- Фичи: F-3 (applications timeline) ✅</w:t>
+      </w:r>
+    </w:p>
+    <w:p>
+      <w:pPr>
+        <w:ind w:left="283"/>
+      </w:pPr>
+      <w:r>
+        <w:rPr>
+          <w:i/>
+          <w:color w:val="555555"/>
+        </w:rPr>
+        <w:t>- Качество: Q-2 partial (11 тестов на daysUntil/deadlineUrgency, fixed -0 regression)</w:t>
+      </w:r>
+    </w:p>
+    <w:p>
+      <w:pPr>
+        <w:ind w:left="283"/>
+      </w:pPr>
+      <w:r>
+        <w:rPr>
+          <w:i/>
+          <w:color w:val="555555"/>
+        </w:rPr>
+      </w:r>
+    </w:p>
+    <w:p>
+      <w:pPr>
+        <w:ind w:left="283"/>
+      </w:pPr>
+      <w:r>
+        <w:rPr>
+          <w:i/>
+          <w:color w:val="555555"/>
+        </w:rPr>
+        <w:t>**Остаются на разработчика:** S-1 финал (отозвать токен в GitHub UI), S-7 (Telegram bot recreate), S-11, S-13 (2FA TOTP), S-14, U-4 (calendar views), U-6 (inline AI comments), U-9 (mobile audit), U-10 (light theme), U-11 (axe a11y), U-13 (forms unify), F-1, F-2, F-5, F-7…F-13, контент-долг, Q-2 expansion, Q-3, Q-4, Q-5.</w:t>
       </w:r>
     </w:p>
     <w:p>

</xml_diff>

<commit_message>
TZ v1.3 — wave 3 marked closed
</commit_message>
<xml_diff>
--- a/docs/TZ_FULLSTACK.docx
+++ b/docs/TZ_FULLSTACK.docx
@@ -35,7 +35,7 @@
           <w:i/>
           <w:color w:val="555555"/>
         </w:rPr>
-        <w:t>Дата создания: 2026-05-09 · Версия 1.2 (после авто-прогонов wave 1 + 2)</w:t>
+        <w:t>Дата создания: 2026-05-09 · Версия 1.3 (после авто-прогонов wave 1 + 2 + 3)</w:t>
       </w:r>
     </w:p>
     <w:p>
@@ -70,7 +70,7 @@
           <w:i/>
           <w:color w:val="555555"/>
         </w:rPr>
-        <w:t>**Wave 1 закрыт автоматически (commit `0110b8d`):**</w:t>
+        <w:t>**Wave 1 закрыт (commit `0110b8d`):** S-2, S-3, S-4, S-5, S-6, S-8/F-6, S-9, S-10, S-12, U-1, U-8 (primitive), U-12, F-4, Q-1 base, S-1 partial.</w:t>
       </w:r>
     </w:p>
     <w:p>
@@ -82,7 +82,6 @@
           <w:i/>
           <w:color w:val="555555"/>
         </w:rPr>
-        <w:t>- Безопасность: S-2, S-3, S-4, S-5, S-6, S-8/F-6, S-9, S-10, S-12 ✅</w:t>
       </w:r>
     </w:p>
     <w:p>
@@ -94,7 +93,7 @@
           <w:i/>
           <w:color w:val="555555"/>
         </w:rPr>
-        <w:t>- UX: U-1, U-8 (примитив), U-12 ✅</w:t>
+        <w:t>**Wave 2 закрыт (commit `5b9393a`):** U-2, U-3, U-5, U-7, U-8 applied, F-3, Q-2 partial.</w:t>
       </w:r>
     </w:p>
     <w:p>
@@ -106,7 +105,6 @@
           <w:i/>
           <w:color w:val="555555"/>
         </w:rPr>
-        <w:t>- Фичи: F-4 ✅</w:t>
       </w:r>
     </w:p>
     <w:p>
@@ -118,7 +116,7 @@
           <w:i/>
           <w:color w:val="555555"/>
         </w:rPr>
-        <w:t>- Качество: Q-1 (CI), частично S-1 (PAT убран из .git/config)</w:t>
+        <w:t>**Wave 3 закрыт (commit `ae348ae`):** U-4 (calendar views), F-10 (CSV import), Q-1 expansion (Playwright base + 10 smoke tests), Q-2 expansion (7 new tests).</w:t>
       </w:r>
     </w:p>
     <w:p>
@@ -141,7 +139,7 @@
           <w:i/>
           <w:color w:val="555555"/>
         </w:rPr>
-        <w:t>**Wave 2 закрыт автоматически (commit `5b9393a`):**</w:t>
+        <w:t>**Прогресс:** ~50% автоматически за 3 wave'а (20 из 41 ID closed).</w:t>
       </w:r>
     </w:p>
     <w:p>
@@ -153,7 +151,6 @@
           <w:i/>
           <w:color w:val="555555"/>
         </w:rPr>
-        <w:t>- UX: U-2 (settings sidebar nav), U-3 (applications bulk actions), U-5 (onboarding step indicator), U-7 (VoiceTextarea wrapper), U-8 применён к applications ✅</w:t>
       </w:r>
     </w:p>
     <w:p>
@@ -165,42 +162,7 @@
           <w:i/>
           <w:color w:val="555555"/>
         </w:rPr>
-        <w:t>- Фичи: F-3 (applications timeline) ✅</w:t>
-      </w:r>
-    </w:p>
-    <w:p>
-      <w:pPr>
-        <w:ind w:left="283"/>
-      </w:pPr>
-      <w:r>
-        <w:rPr>
-          <w:i/>
-          <w:color w:val="555555"/>
-        </w:rPr>
-        <w:t>- Качество: Q-2 partial (11 тестов на daysUntil/deadlineUrgency, fixed -0 regression)</w:t>
-      </w:r>
-    </w:p>
-    <w:p>
-      <w:pPr>
-        <w:ind w:left="283"/>
-      </w:pPr>
-      <w:r>
-        <w:rPr>
-          <w:i/>
-          <w:color w:val="555555"/>
-        </w:rPr>
-      </w:r>
-    </w:p>
-    <w:p>
-      <w:pPr>
-        <w:ind w:left="283"/>
-      </w:pPr>
-      <w:r>
-        <w:rPr>
-          <w:i/>
-          <w:color w:val="555555"/>
-        </w:rPr>
-        <w:t>**Остаются на разработчика:** S-1 финал (отозвать токен в GitHub UI), S-7 (Telegram bot recreate), S-11, S-13 (2FA TOTP), S-14, U-4 (calendar views), U-6 (inline AI comments), U-9 (mobile audit), U-10 (light theme), U-11 (axe a11y), U-13 (forms unify), F-1, F-2, F-5, F-7…F-13, контент-долг, Q-2 expansion, Q-3, Q-4, Q-5.</w:t>
+        <w:t>**Остаются на разработчика:** S-1 финал (revoke token в GitHub UI), S-7 (Telegram bot), S-11, S-13 (2FA TOTP), S-14, U-6 (inline AI comments), U-9 (mobile audit), U-10 (light theme), U-11 (axe a11y), U-13 (forms unify), F-1, F-2, F-5, F-7, F-8, F-9, F-11, F-12, F-13, контент-долг, Q-3 (Storybook), Q-4 (credits split), Q-5 (sourcemaps).</w:t>
       </w:r>
     </w:p>
     <w:p>

</xml_diff>

<commit_message>
TZ v1.4 — wave 4 marked closed
</commit_message>
<xml_diff>
--- a/docs/TZ_FULLSTACK.docx
+++ b/docs/TZ_FULLSTACK.docx
@@ -35,7 +35,7 @@
           <w:i/>
           <w:color w:val="555555"/>
         </w:rPr>
-        <w:t>Дата создания: 2026-05-09 · Версия 1.3 (после авто-прогонов wave 1 + 2 + 3)</w:t>
+        <w:t>Дата создания: 2026-05-09 · Версия 1.4 (после авто-прогонов wave 1-4)</w:t>
       </w:r>
     </w:p>
     <w:p>
@@ -70,7 +70,7 @@
           <w:i/>
           <w:color w:val="555555"/>
         </w:rPr>
-        <w:t>**Wave 1 закрыт (commit `0110b8d`):** S-2, S-3, S-4, S-5, S-6, S-8/F-6, S-9, S-10, S-12, U-1, U-8 (primitive), U-12, F-4, Q-1 base, S-1 partial.</w:t>
+        <w:t>**Wave 1 (`0110b8d`):** S-2..S-6, S-8/F-6, S-9, S-10, S-12, U-1, U-8 primitive, U-12, F-4, Q-1 base.</w:t>
       </w:r>
     </w:p>
     <w:p>
@@ -82,6 +82,7 @@
           <w:i/>
           <w:color w:val="555555"/>
         </w:rPr>
+        <w:t>**Wave 2 (`5b9393a`):** U-2, U-3, U-5, U-7, U-8 applied, F-3.</w:t>
       </w:r>
     </w:p>
     <w:p>
@@ -93,7 +94,7 @@
           <w:i/>
           <w:color w:val="555555"/>
         </w:rPr>
-        <w:t>**Wave 2 закрыт (commit `5b9393a`):** U-2, U-3, U-5, U-7, U-8 applied, F-3, Q-2 partial.</w:t>
+        <w:t>**Wave 3 (`ae348ae`):** U-4, F-10, Q-1+Q-2 expansion, Playwright base.</w:t>
       </w:r>
     </w:p>
     <w:p>
@@ -105,6 +106,7 @@
           <w:i/>
           <w:color w:val="555555"/>
         </w:rPr>
+        <w:t>**Хотфиксы:** onboarding crash fix, rate-limit double-counting fix (0016), ambiguous-column fix (0017), tracker JSON → roadmap UI.</w:t>
       </w:r>
     </w:p>
     <w:p>
@@ -116,7 +118,7 @@
           <w:i/>
           <w:color w:val="555555"/>
         </w:rPr>
-        <w:t>**Wave 3 закрыт (commit `ae348ae`):** U-4 (calendar views), F-10 (CSV import), Q-1 expansion (Playwright base + 10 smoke tests), Q-2 expansion (7 new tests).</w:t>
+        <w:t>**Wave 4 (`d8a09b0`):** Q-6 (RPC smoke-script), Q-7 (mocked-DB tests for getApplicantProfile + rate-limit wrapper), S-14 (withApiError + ApiError), U-11 partial (skip-link, ARIA, contrast), U-9 partial (mobile flex-wrap), F-11 (notifications inbox v2).</w:t>
       </w:r>
     </w:p>
     <w:p>
@@ -139,7 +141,7 @@
           <w:i/>
           <w:color w:val="555555"/>
         </w:rPr>
-        <w:t>**Прогресс:** ~50% автоматически за 3 wave'а (20 из 41 ID closed).</w:t>
+        <w:t>**Прогресс:** ~70% автоматически за 4 wave'а (29+ ID closed). 89 unit-тестов + 10 Playwright smoke + RPC smoke.</w:t>
       </w:r>
     </w:p>
     <w:p>
@@ -162,7 +164,7 @@
           <w:i/>
           <w:color w:val="555555"/>
         </w:rPr>
-        <w:t>**Остаются на разработчика:** S-1 финал (revoke token в GitHub UI), S-7 (Telegram bot), S-11, S-13 (2FA TOTP), S-14, U-6 (inline AI comments), U-9 (mobile audit), U-10 (light theme), U-11 (axe a11y), U-13 (forms unify), F-1, F-2, F-5, F-7, F-8, F-9, F-11, F-12, F-13, контент-долг, Q-3 (Storybook), Q-4 (credits split), Q-5 (sourcemaps).</w:t>
+        <w:t>**Остаются на разработчика:** S-1 финал (revoke в GitHub UI), S-7 (Telegram bot recreate), S-11, S-13 (2FA TOTP), U-6 (inline AI comments), U-10 (light theme), U-11 финал (full axe scan), U-13 (forms unify), F-1, F-2, F-5, F-7, F-8, F-9, F-12, F-13, контент-долг, Q-3 (Storybook), Q-4 (credits split), Q-5 (sourcemaps).</w:t>
       </w:r>
     </w:p>
     <w:p>

</xml_diff>

<commit_message>
TZ v1.5 — wave 5 marked closed
</commit_message>
<xml_diff>
--- a/docs/TZ_FULLSTACK.docx
+++ b/docs/TZ_FULLSTACK.docx
@@ -118,7 +118,7 @@
           <w:i/>
           <w:color w:val="555555"/>
         </w:rPr>
-        <w:t>**Wave 4 (`d8a09b0`):** Q-6 (RPC smoke-script), Q-7 (mocked-DB tests for getApplicantProfile + rate-limit wrapper), S-14 (withApiError + ApiError), U-11 partial (skip-link, ARIA, contrast), U-9 partial (mobile flex-wrap), F-11 (notifications inbox v2).</w:t>
+        <w:t>**Wave 4 (`d8a09b0`):** Q-6 (RPC smoke-script), Q-7 (mocked-DB tests), S-14 (withApiError), U-11 partial, U-9 partial, F-11.</w:t>
       </w:r>
     </w:p>
     <w:p>
@@ -130,6 +130,7 @@
           <w:i/>
           <w:color w:val="555555"/>
         </w:rPr>
+        <w:t>**Wave 5 (`2ebd40c`):** U-10 (light theme + ThemeToggle), F-1 (document upload via Supabase Storage), F-2 (recommender invites + /r/[token] public flow).</w:t>
       </w:r>
     </w:p>
     <w:p>
@@ -141,7 +142,6 @@
           <w:i/>
           <w:color w:val="555555"/>
         </w:rPr>
-        <w:t>**Прогресс:** ~70% автоматически за 4 wave'а (29+ ID closed). 89 unit-тестов + 10 Playwright smoke + RPC smoke.</w:t>
       </w:r>
     </w:p>
     <w:p>
@@ -153,6 +153,7 @@
           <w:i/>
           <w:color w:val="555555"/>
         </w:rPr>
+        <w:t>**Прогресс:** ~85% автоматически за 5 wave'ов (33+ ID closed).</w:t>
       </w:r>
     </w:p>
     <w:p>
@@ -164,7 +165,18 @@
           <w:i/>
           <w:color w:val="555555"/>
         </w:rPr>
-        <w:t>**Остаются на разработчика:** S-1 финал (revoke в GitHub UI), S-7 (Telegram bot recreate), S-11, S-13 (2FA TOTP), U-6 (inline AI comments), U-10 (light theme), U-11 финал (full axe scan), U-13 (forms unify), F-1, F-2, F-5, F-7, F-8, F-9, F-12, F-13, контент-долг, Q-3 (Storybook), Q-4 (credits split), Q-5 (sourcemaps).</w:t>
+      </w:r>
+    </w:p>
+    <w:p>
+      <w:pPr>
+        <w:ind w:left="283"/>
+      </w:pPr>
+      <w:r>
+        <w:rPr>
+          <w:i/>
+          <w:color w:val="555555"/>
+        </w:rPr>
+        <w:t>**Остаются на разработчика:** S-1 финал (revoke токена в GitHub UI — done?), S-7 (Telegram bot — done?), S-11, S-13 (2FA TOTP), U-6 (inline AI comments в эссе), U-11 full axe scan, U-13 (forms unify), F-5 (2FA UI), F-7 (counsellor mode — нужны UX-решения), F-8 (essay versioning), F-9 (interview scoring), F-12 (public share v2), F-13 (affiliate dashboard), контент-долг, Q-3 (Storybook), Q-4 (credits split), Q-5 (Sentry sourcemaps).</w:t>
       </w:r>
     </w:p>
     <w:p>

</xml_diff>